<commit_message>
add why starter use iris dataset
</commit_message>
<xml_diff>
--- a/kdd_process/KDD_Process_DataMining.docx
+++ b/kdd_process/KDD_Process_DataMining.docx
@@ -7335,12 +7335,145 @@
         </w:tblBorders>
       </w:tblPr>
       <w:tblGrid>
-        <w:gridCol w:w="9360"/>
+        <w:gridCol w:w="3000"/>
+        <w:gridCol w:w="2500"/>
+        <w:gridCol w:w="2360"/>
+        <w:gridCol w:w="1500"/>
       </w:tblGrid>
       <w:tr>
-        <w:tc>
-          <w:tcPr>
-            <w:tcW w:type="dxa" w:w="9360"/>
+        <w:trPr>
+          <w:tblHeader/>
+        </w:trPr>
+        <w:tc>
+          <w:tcPr>
+            <w:tcW w:type="dxa" w:w="3000"/>
+            <w:tcBorders>
+              <w:top w:val="single" w:color="D0D4E0" w:sz="1"/>
+              <w:left w:val="single" w:color="D0D4E0" w:sz="1"/>
+              <w:bottom w:val="single" w:color="D0D4E0" w:sz="1"/>
+              <w:right w:val="single" w:color="D0D4E0" w:sz="1"/>
+            </w:tcBorders>
+            <w:shd w:fill="6B3FA0" w:val="clear"/>
+            <w:tcMar>
+              <w:top w:type="dxa" w:w="100"/>
+              <w:left w:type="dxa" w:w="140"/>
+              <w:bottom w:type="dxa" w:w="100"/>
+              <w:right w:type="dxa" w:w="140"/>
+            </w:tcMar>
+          </w:tcPr>
+          <w:p>
+            <w:r>
+              <w:rPr>
+                <w:rFonts w:ascii="Arial" w:cs="Arial" w:eastAsia="Arial" w:hAnsi="Arial"/>
+                <w:b/>
+                <w:bCs/>
+                <w:color w:val="FFFFFF"/>
+                <w:sz w:val="20"/>
+                <w:szCs w:val="20"/>
+              </w:rPr>
+              <w:t xml:space="preserve">Condition</w:t>
+            </w:r>
+          </w:p>
+        </w:tc>
+        <w:tc>
+          <w:tcPr>
+            <w:tcW w:type="dxa" w:w="2500"/>
+            <w:tcBorders>
+              <w:top w:val="single" w:color="D0D4E0" w:sz="1"/>
+              <w:left w:val="single" w:color="D0D4E0" w:sz="1"/>
+              <w:bottom w:val="single" w:color="D0D4E0" w:sz="1"/>
+              <w:right w:val="single" w:color="D0D4E0" w:sz="1"/>
+            </w:tcBorders>
+            <w:shd w:fill="6B3FA0" w:val="clear"/>
+            <w:tcMar>
+              <w:top w:type="dxa" w:w="100"/>
+              <w:left w:type="dxa" w:w="140"/>
+              <w:bottom w:type="dxa" w:w="100"/>
+              <w:right w:type="dxa" w:w="140"/>
+            </w:tcMar>
+          </w:tcPr>
+          <w:p>
+            <w:r>
+              <w:rPr>
+                <w:rFonts w:ascii="Arial" w:cs="Arial" w:eastAsia="Arial" w:hAnsi="Arial"/>
+                <w:b/>
+                <w:bCs/>
+                <w:color w:val="FFFFFF"/>
+                <w:sz w:val="20"/>
+                <w:szCs w:val="20"/>
+              </w:rPr>
+              <w:t xml:space="preserve">Sub-condition</w:t>
+            </w:r>
+          </w:p>
+        </w:tc>
+        <w:tc>
+          <w:tcPr>
+            <w:tcW w:type="dxa" w:w="2360"/>
+            <w:tcBorders>
+              <w:top w:val="single" w:color="D0D4E0" w:sz="1"/>
+              <w:left w:val="single" w:color="D0D4E0" w:sz="1"/>
+              <w:bottom w:val="single" w:color="D0D4E0" w:sz="1"/>
+              <w:right w:val="single" w:color="D0D4E0" w:sz="1"/>
+            </w:tcBorders>
+            <w:shd w:fill="6B3FA0" w:val="clear"/>
+            <w:tcMar>
+              <w:top w:type="dxa" w:w="100"/>
+              <w:left w:type="dxa" w:w="140"/>
+              <w:bottom w:type="dxa" w:w="100"/>
+              <w:right w:type="dxa" w:w="140"/>
+            </w:tcMar>
+          </w:tcPr>
+          <w:p>
+            <w:r>
+              <w:rPr>
+                <w:rFonts w:ascii="Arial" w:cs="Arial" w:eastAsia="Arial" w:hAnsi="Arial"/>
+                <w:b/>
+                <w:bCs/>
+                <w:color w:val="FFFFFF"/>
+                <w:sz w:val="20"/>
+                <w:szCs w:val="20"/>
+              </w:rPr>
+              <w:t xml:space="preserve">Customer Type</w:t>
+            </w:r>
+          </w:p>
+        </w:tc>
+        <w:tc>
+          <w:tcPr>
+            <w:tcW w:type="dxa" w:w="1500"/>
+            <w:tcBorders>
+              <w:top w:val="single" w:color="D0D4E0" w:sz="1"/>
+              <w:left w:val="single" w:color="D0D4E0" w:sz="1"/>
+              <w:bottom w:val="single" w:color="D0D4E0" w:sz="1"/>
+              <w:right w:val="single" w:color="D0D4E0" w:sz="1"/>
+            </w:tcBorders>
+            <w:shd w:fill="6B3FA0" w:val="clear"/>
+            <w:tcMar>
+              <w:top w:type="dxa" w:w="100"/>
+              <w:left w:type="dxa" w:w="140"/>
+              <w:bottom w:type="dxa" w:w="100"/>
+              <w:right w:type="dxa" w:w="140"/>
+            </w:tcMar>
+          </w:tcPr>
+          <w:p>
+            <w:r>
+              <w:rPr>
+                <w:rFonts w:ascii="Arial" w:cs="Arial" w:eastAsia="Arial" w:hAnsi="Arial"/>
+                <w:b/>
+                <w:bCs/>
+                <w:color w:val="FFFFFF"/>
+                <w:sz w:val="20"/>
+                <w:szCs w:val="20"/>
+              </w:rPr>
+              <w:t xml:space="preserve">Label</w:t>
+            </w:r>
+          </w:p>
+        </w:tc>
+      </w:tr>
+      <w:tr>
+        <w:tc>
+          <w:tcPr>
+            <w:tcW w:type="dxa" w:w="3000"/>
+            <w:vMerge w:val="restart"/>
             <w:tcBorders>
               <w:top w:val="single" w:color="D0D4E0" w:sz="1"/>
               <w:left w:val="single" w:color="D0D4E0" w:sz="1"/>
@@ -7349,27 +7482,528 @@
             </w:tcBorders>
             <w:shd w:fill="F5F0FF" w:val="clear"/>
             <w:tcMar>
-              <w:top w:type="dxa" w:w="120"/>
-              <w:left w:type="dxa" w:w="200"/>
-              <w:bottom w:type="dxa" w:w="120"/>
-              <w:right w:type="dxa" w:w="200"/>
-            </w:tcMar>
-          </w:tcPr>
-          <w:p>
-            <w:r>
-              <w:rPr>
-                <w:rFonts w:ascii="Courier New" w:cs="Courier New" w:eastAsia="Courier New" w:hAnsi="Courier New"/>
+              <w:top w:type="dxa" w:w="80"/>
+              <w:left w:type="dxa" w:w="140"/>
+              <w:bottom w:type="dxa" w:w="80"/>
+              <w:right w:type="dxa" w:w="140"/>
+            </w:tcMar>
+          </w:tcPr>
+          <w:p>
+            <w:r>
+              <w:rPr>
+                <w:rFonts w:ascii="Arial" w:cs="Arial" w:eastAsia="Arial" w:hAnsi="Arial"/>
+                <w:b/>
+                <w:bCs/>
                 <w:color w:val="6B3FA0"/>
                 <w:sz w:val="20"/>
                 <w:szCs w:val="20"/>
               </w:rPr>
-              <w:t xml:space="preserve">Avg Monthly Spend?
-├── &gt; $200  →  Premium Customer
-│   ├── Visits/month &gt; 8  →  VIP
-│   └── Visits/month ≤ 8  →  High Value
-├── $50–200  →  Regular Customer
-└── &lt; $50   →  Occasional Customer
-Model Accuracy: 87.4%   |   Algorithm: CART Decision Tree</w:t>
+              <w:t xml:space="preserve">Avg Spend &gt; $200</w:t>
+            </w:r>
+          </w:p>
+        </w:tc>
+        <w:tc>
+          <w:tcPr>
+            <w:tcW w:type="dxa" w:w="2500"/>
+            <w:tcBorders>
+              <w:top w:val="single" w:color="D0D4E0" w:sz="1"/>
+              <w:left w:val="single" w:color="D0D4E0" w:sz="1"/>
+              <w:bottom w:val="single" w:color="D0D4E0" w:sz="1"/>
+              <w:right w:val="single" w:color="D0D4E0" w:sz="1"/>
+            </w:tcBorders>
+            <w:shd w:fill="FAFAFA" w:val="clear"/>
+            <w:tcMar>
+              <w:top w:type="dxa" w:w="80"/>
+              <w:left w:type="dxa" w:w="140"/>
+              <w:bottom w:type="dxa" w:w="80"/>
+              <w:right w:type="dxa" w:w="140"/>
+            </w:tcMar>
+          </w:tcPr>
+          <w:p>
+            <w:r>
+              <w:rPr>
+                <w:rFonts w:ascii="Arial" w:cs="Arial" w:eastAsia="Arial" w:hAnsi="Arial"/>
+                <w:color w:val="333333"/>
+                <w:sz w:val="20"/>
+                <w:szCs w:val="20"/>
+              </w:rPr>
+              <w:t xml:space="preserve">Visits/month &gt; 8</w:t>
+            </w:r>
+          </w:p>
+        </w:tc>
+        <w:tc>
+          <w:tcPr>
+            <w:tcW w:type="dxa" w:w="2360"/>
+            <w:tcBorders>
+              <w:top w:val="single" w:color="D0D4E0" w:sz="1"/>
+              <w:left w:val="single" w:color="D0D4E0" w:sz="1"/>
+              <w:bottom w:val="single" w:color="D0D4E0" w:sz="1"/>
+              <w:right w:val="single" w:color="D0D4E0" w:sz="1"/>
+            </w:tcBorders>
+            <w:shd w:fill="FAFAFA" w:val="clear"/>
+            <w:tcMar>
+              <w:top w:type="dxa" w:w="80"/>
+              <w:left w:type="dxa" w:w="140"/>
+              <w:bottom w:type="dxa" w:w="80"/>
+              <w:right w:type="dxa" w:w="140"/>
+            </w:tcMar>
+          </w:tcPr>
+          <w:p>
+            <w:r>
+              <w:rPr>
+                <w:rFonts w:ascii="Arial" w:cs="Arial" w:eastAsia="Arial" w:hAnsi="Arial"/>
+                <w:color w:val="333333"/>
+                <w:sz w:val="20"/>
+                <w:szCs w:val="20"/>
+              </w:rPr>
+              <w:t xml:space="preserve">Premium Customer</w:t>
+            </w:r>
+          </w:p>
+        </w:tc>
+        <w:tc>
+          <w:tcPr>
+            <w:tcW w:type="dxa" w:w="1500"/>
+            <w:tcBorders>
+              <w:top w:val="single" w:color="D0D4E0" w:sz="1"/>
+              <w:left w:val="single" w:color="D0D4E0" w:sz="1"/>
+              <w:bottom w:val="single" w:color="D0D4E0" w:sz="1"/>
+              <w:right w:val="single" w:color="D0D4E0" w:sz="1"/>
+            </w:tcBorders>
+            <w:shd w:fill="EDE0FF" w:val="clear"/>
+            <w:tcMar>
+              <w:top w:type="dxa" w:w="80"/>
+              <w:left w:type="dxa" w:w="140"/>
+              <w:bottom w:type="dxa" w:w="80"/>
+              <w:right w:type="dxa" w:w="140"/>
+            </w:tcMar>
+          </w:tcPr>
+          <w:p>
+            <w:r>
+              <w:rPr>
+                <w:rFonts w:ascii="Arial" w:cs="Arial" w:eastAsia="Arial" w:hAnsi="Arial"/>
+                <w:b/>
+                <w:bCs/>
+                <w:color w:val="6B3FA0"/>
+                <w:sz w:val="20"/>
+                <w:szCs w:val="20"/>
+              </w:rPr>
+              <w:t xml:space="preserve">VIP 👑</w:t>
+            </w:r>
+          </w:p>
+        </w:tc>
+      </w:tr>
+      <w:tr>
+        <w:tc>
+          <w:tcPr>
+            <w:vMerge w:val="continue"/>
+            <w:tcBorders>
+              <w:top w:val="single" w:color="D0D4E0" w:sz="1"/>
+              <w:left w:val="single" w:color="D0D4E0" w:sz="1"/>
+              <w:bottom w:val="single" w:color="D0D4E0" w:sz="1"/>
+              <w:right w:val="single" w:color="D0D4E0" w:sz="1"/>
+            </w:tcBorders>
+          </w:tcPr>
+          <w:p/>
+        </w:tc>
+        <w:tc>
+          <w:tcPr>
+            <w:tcW w:type="dxa" w:w="2500"/>
+            <w:tcBorders>
+              <w:top w:val="single" w:color="D0D4E0" w:sz="1"/>
+              <w:left w:val="single" w:color="D0D4E0" w:sz="1"/>
+              <w:bottom w:val="single" w:color="D0D4E0" w:sz="1"/>
+              <w:right w:val="single" w:color="D0D4E0" w:sz="1"/>
+            </w:tcBorders>
+            <w:shd w:fill="FAFAFA" w:val="clear"/>
+            <w:tcMar>
+              <w:top w:type="dxa" w:w="80"/>
+              <w:left w:type="dxa" w:w="140"/>
+              <w:bottom w:type="dxa" w:w="80"/>
+              <w:right w:type="dxa" w:w="140"/>
+            </w:tcMar>
+          </w:tcPr>
+          <w:p>
+            <w:r>
+              <w:rPr>
+                <w:rFonts w:ascii="Arial" w:cs="Arial" w:eastAsia="Arial" w:hAnsi="Arial"/>
+                <w:color w:val="333333"/>
+                <w:sz w:val="20"/>
+                <w:szCs w:val="20"/>
+              </w:rPr>
+              <w:t xml:space="preserve">Visits/month &lt;= 8</w:t>
+            </w:r>
+          </w:p>
+        </w:tc>
+        <w:tc>
+          <w:tcPr>
+            <w:tcW w:type="dxa" w:w="2360"/>
+            <w:tcBorders>
+              <w:top w:val="single" w:color="D0D4E0" w:sz="1"/>
+              <w:left w:val="single" w:color="D0D4E0" w:sz="1"/>
+              <w:bottom w:val="single" w:color="D0D4E0" w:sz="1"/>
+              <w:right w:val="single" w:color="D0D4E0" w:sz="1"/>
+            </w:tcBorders>
+            <w:shd w:fill="FAFAFA" w:val="clear"/>
+            <w:tcMar>
+              <w:top w:type="dxa" w:w="80"/>
+              <w:left w:type="dxa" w:w="140"/>
+              <w:bottom w:type="dxa" w:w="80"/>
+              <w:right w:type="dxa" w:w="140"/>
+            </w:tcMar>
+          </w:tcPr>
+          <w:p>
+            <w:r>
+              <w:rPr>
+                <w:rFonts w:ascii="Arial" w:cs="Arial" w:eastAsia="Arial" w:hAnsi="Arial"/>
+                <w:color w:val="333333"/>
+                <w:sz w:val="20"/>
+                <w:szCs w:val="20"/>
+              </w:rPr>
+              <w:t xml:space="preserve">Premium Customer</w:t>
+            </w:r>
+          </w:p>
+        </w:tc>
+        <w:tc>
+          <w:tcPr>
+            <w:tcW w:type="dxa" w:w="1500"/>
+            <w:tcBorders>
+              <w:top w:val="single" w:color="D0D4E0" w:sz="1"/>
+              <w:left w:val="single" w:color="D0D4E0" w:sz="1"/>
+              <w:bottom w:val="single" w:color="D0D4E0" w:sz="1"/>
+              <w:right w:val="single" w:color="D0D4E0" w:sz="1"/>
+            </w:tcBorders>
+            <w:shd w:fill="EDE0FF" w:val="clear"/>
+            <w:tcMar>
+              <w:top w:type="dxa" w:w="80"/>
+              <w:left w:type="dxa" w:w="140"/>
+              <w:bottom w:type="dxa" w:w="80"/>
+              <w:right w:type="dxa" w:w="140"/>
+            </w:tcMar>
+          </w:tcPr>
+          <w:p>
+            <w:r>
+              <w:rPr>
+                <w:rFonts w:ascii="Arial" w:cs="Arial" w:eastAsia="Arial" w:hAnsi="Arial"/>
+                <w:b/>
+                <w:bCs/>
+                <w:color w:val="6B3FA0"/>
+                <w:sz w:val="20"/>
+                <w:szCs w:val="20"/>
+              </w:rPr>
+              <w:t xml:space="preserve">High Value</w:t>
+            </w:r>
+          </w:p>
+        </w:tc>
+      </w:tr>
+      <w:tr>
+        <w:tc>
+          <w:tcPr>
+            <w:tcW w:type="dxa" w:w="3000"/>
+            <w:tcBorders>
+              <w:top w:val="single" w:color="D0D4E0" w:sz="1"/>
+              <w:left w:val="single" w:color="D0D4E0" w:sz="1"/>
+              <w:bottom w:val="single" w:color="D0D4E0" w:sz="1"/>
+              <w:right w:val="single" w:color="D0D4E0" w:sz="1"/>
+            </w:tcBorders>
+            <w:shd w:fill="F5F0FF" w:val="clear"/>
+            <w:tcMar>
+              <w:top w:type="dxa" w:w="80"/>
+              <w:left w:type="dxa" w:w="140"/>
+              <w:bottom w:type="dxa" w:w="80"/>
+              <w:right w:type="dxa" w:w="140"/>
+            </w:tcMar>
+          </w:tcPr>
+          <w:p>
+            <w:r>
+              <w:rPr>
+                <w:rFonts w:ascii="Arial" w:cs="Arial" w:eastAsia="Arial" w:hAnsi="Arial"/>
+                <w:b/>
+                <w:bCs/>
+                <w:color w:val="6B3FA0"/>
+                <w:sz w:val="20"/>
+                <w:szCs w:val="20"/>
+              </w:rPr>
+              <w:t xml:space="preserve">Avg Spend $50–$200</w:t>
+            </w:r>
+          </w:p>
+        </w:tc>
+        <w:tc>
+          <w:tcPr>
+            <w:tcW w:type="dxa" w:w="2500"/>
+            <w:tcBorders>
+              <w:top w:val="single" w:color="D0D4E0" w:sz="1"/>
+              <w:left w:val="single" w:color="D0D4E0" w:sz="1"/>
+              <w:bottom w:val="single" w:color="D0D4E0" w:sz="1"/>
+              <w:right w:val="single" w:color="D0D4E0" w:sz="1"/>
+            </w:tcBorders>
+            <w:shd w:fill="FAFAFA" w:val="clear"/>
+            <w:tcMar>
+              <w:top w:type="dxa" w:w="80"/>
+              <w:left w:type="dxa" w:w="140"/>
+              <w:bottom w:type="dxa" w:w="80"/>
+              <w:right w:type="dxa" w:w="140"/>
+            </w:tcMar>
+          </w:tcPr>
+          <w:p>
+            <w:r>
+              <w:rPr>
+                <w:rFonts w:ascii="Arial" w:cs="Arial" w:eastAsia="Arial" w:hAnsi="Arial"/>
+                <w:i/>
+                <w:iCs/>
+                <w:color w:val="888888"/>
+                <w:sz w:val="20"/>
+                <w:szCs w:val="20"/>
+              </w:rPr>
+              <w:t xml:space="preserve">Any</w:t>
+            </w:r>
+          </w:p>
+        </w:tc>
+        <w:tc>
+          <w:tcPr>
+            <w:tcW w:type="dxa" w:w="2360"/>
+            <w:tcBorders>
+              <w:top w:val="single" w:color="D0D4E0" w:sz="1"/>
+              <w:left w:val="single" w:color="D0D4E0" w:sz="1"/>
+              <w:bottom w:val="single" w:color="D0D4E0" w:sz="1"/>
+              <w:right w:val="single" w:color="D0D4E0" w:sz="1"/>
+            </w:tcBorders>
+            <w:shd w:fill="FAFAFA" w:val="clear"/>
+            <w:tcMar>
+              <w:top w:type="dxa" w:w="80"/>
+              <w:left w:type="dxa" w:w="140"/>
+              <w:bottom w:type="dxa" w:w="80"/>
+              <w:right w:type="dxa" w:w="140"/>
+            </w:tcMar>
+          </w:tcPr>
+          <w:p>
+            <w:r>
+              <w:rPr>
+                <w:rFonts w:ascii="Arial" w:cs="Arial" w:eastAsia="Arial" w:hAnsi="Arial"/>
+                <w:color w:val="888888"/>
+                <w:sz w:val="20"/>
+                <w:szCs w:val="20"/>
+              </w:rPr>
+              <w:t xml:space="preserve">—</w:t>
+            </w:r>
+          </w:p>
+        </w:tc>
+        <w:tc>
+          <w:tcPr>
+            <w:tcW w:type="dxa" w:w="1500"/>
+            <w:tcBorders>
+              <w:top w:val="single" w:color="D0D4E0" w:sz="1"/>
+              <w:left w:val="single" w:color="D0D4E0" w:sz="1"/>
+              <w:bottom w:val="single" w:color="D0D4E0" w:sz="1"/>
+              <w:right w:val="single" w:color="D0D4E0" w:sz="1"/>
+            </w:tcBorders>
+            <w:shd w:fill="EDE0FF" w:val="clear"/>
+            <w:tcMar>
+              <w:top w:type="dxa" w:w="80"/>
+              <w:left w:type="dxa" w:w="140"/>
+              <w:bottom w:type="dxa" w:w="80"/>
+              <w:right w:type="dxa" w:w="140"/>
+            </w:tcMar>
+          </w:tcPr>
+          <w:p>
+            <w:r>
+              <w:rPr>
+                <w:rFonts w:ascii="Arial" w:cs="Arial" w:eastAsia="Arial" w:hAnsi="Arial"/>
+                <w:b/>
+                <w:bCs/>
+                <w:color w:val="6B3FA0"/>
+                <w:sz w:val="20"/>
+                <w:szCs w:val="20"/>
+              </w:rPr>
+              <w:t xml:space="preserve">Regular 🛒</w:t>
+            </w:r>
+          </w:p>
+        </w:tc>
+      </w:tr>
+      <w:tr>
+        <w:tc>
+          <w:tcPr>
+            <w:tcW w:type="dxa" w:w="3000"/>
+            <w:tcBorders>
+              <w:top w:val="single" w:color="D0D4E0" w:sz="1"/>
+              <w:left w:val="single" w:color="D0D4E0" w:sz="1"/>
+              <w:bottom w:val="single" w:color="D0D4E0" w:sz="1"/>
+              <w:right w:val="single" w:color="D0D4E0" w:sz="1"/>
+            </w:tcBorders>
+            <w:shd w:fill="F5F0FF" w:val="clear"/>
+            <w:tcMar>
+              <w:top w:type="dxa" w:w="80"/>
+              <w:left w:type="dxa" w:w="140"/>
+              <w:bottom w:type="dxa" w:w="80"/>
+              <w:right w:type="dxa" w:w="140"/>
+            </w:tcMar>
+          </w:tcPr>
+          <w:p>
+            <w:r>
+              <w:rPr>
+                <w:rFonts w:ascii="Arial" w:cs="Arial" w:eastAsia="Arial" w:hAnsi="Arial"/>
+                <w:b/>
+                <w:bCs/>
+                <w:color w:val="6B3FA0"/>
+                <w:sz w:val="20"/>
+                <w:szCs w:val="20"/>
+              </w:rPr>
+              <w:t xml:space="preserve">Avg Spend &lt; $50</w:t>
+            </w:r>
+          </w:p>
+        </w:tc>
+        <w:tc>
+          <w:tcPr>
+            <w:tcW w:type="dxa" w:w="2500"/>
+            <w:tcBorders>
+              <w:top w:val="single" w:color="D0D4E0" w:sz="1"/>
+              <w:left w:val="single" w:color="D0D4E0" w:sz="1"/>
+              <w:bottom w:val="single" w:color="D0D4E0" w:sz="1"/>
+              <w:right w:val="single" w:color="D0D4E0" w:sz="1"/>
+            </w:tcBorders>
+            <w:shd w:fill="FAFAFA" w:val="clear"/>
+            <w:tcMar>
+              <w:top w:type="dxa" w:w="80"/>
+              <w:left w:type="dxa" w:w="140"/>
+              <w:bottom w:type="dxa" w:w="80"/>
+              <w:right w:type="dxa" w:w="140"/>
+            </w:tcMar>
+          </w:tcPr>
+          <w:p>
+            <w:r>
+              <w:rPr>
+                <w:rFonts w:ascii="Arial" w:cs="Arial" w:eastAsia="Arial" w:hAnsi="Arial"/>
+                <w:i/>
+                <w:iCs/>
+                <w:color w:val="888888"/>
+                <w:sz w:val="20"/>
+                <w:szCs w:val="20"/>
+              </w:rPr>
+              <w:t xml:space="preserve">Any</w:t>
+            </w:r>
+          </w:p>
+        </w:tc>
+        <w:tc>
+          <w:tcPr>
+            <w:tcW w:type="dxa" w:w="2360"/>
+            <w:tcBorders>
+              <w:top w:val="single" w:color="D0D4E0" w:sz="1"/>
+              <w:left w:val="single" w:color="D0D4E0" w:sz="1"/>
+              <w:bottom w:val="single" w:color="D0D4E0" w:sz="1"/>
+              <w:right w:val="single" w:color="D0D4E0" w:sz="1"/>
+            </w:tcBorders>
+            <w:shd w:fill="FAFAFA" w:val="clear"/>
+            <w:tcMar>
+              <w:top w:type="dxa" w:w="80"/>
+              <w:left w:type="dxa" w:w="140"/>
+              <w:bottom w:type="dxa" w:w="80"/>
+              <w:right w:type="dxa" w:w="140"/>
+            </w:tcMar>
+          </w:tcPr>
+          <w:p>
+            <w:r>
+              <w:rPr>
+                <w:rFonts w:ascii="Arial" w:cs="Arial" w:eastAsia="Arial" w:hAnsi="Arial"/>
+                <w:color w:val="888888"/>
+                <w:sz w:val="20"/>
+                <w:szCs w:val="20"/>
+              </w:rPr>
+              <w:t xml:space="preserve">—</w:t>
+            </w:r>
+          </w:p>
+        </w:tc>
+        <w:tc>
+          <w:tcPr>
+            <w:tcW w:type="dxa" w:w="1500"/>
+            <w:tcBorders>
+              <w:top w:val="single" w:color="D0D4E0" w:sz="1"/>
+              <w:left w:val="single" w:color="D0D4E0" w:sz="1"/>
+              <w:bottom w:val="single" w:color="D0D4E0" w:sz="1"/>
+              <w:right w:val="single" w:color="D0D4E0" w:sz="1"/>
+            </w:tcBorders>
+            <w:shd w:fill="EDE0FF" w:val="clear"/>
+            <w:tcMar>
+              <w:top w:type="dxa" w:w="80"/>
+              <w:left w:type="dxa" w:w="140"/>
+              <w:bottom w:type="dxa" w:w="80"/>
+              <w:right w:type="dxa" w:w="140"/>
+            </w:tcMar>
+          </w:tcPr>
+          <w:p>
+            <w:r>
+              <w:rPr>
+                <w:rFonts w:ascii="Arial" w:cs="Arial" w:eastAsia="Arial" w:hAnsi="Arial"/>
+                <w:b/>
+                <w:bCs/>
+                <w:color w:val="6B3FA0"/>
+                <w:sz w:val="20"/>
+                <w:szCs w:val="20"/>
+              </w:rPr>
+              <w:t xml:space="preserve">Occasional 👋</w:t>
+            </w:r>
+          </w:p>
+        </w:tc>
+      </w:tr>
+      <w:tr>
+        <w:tc>
+          <w:tcPr>
+            <w:tcW w:type="dxa" w:w="9360"/>
+            <w:gridSpan w:val="4"/>
+            <w:tcBorders>
+              <w:top w:val="single" w:color="D0D4E0" w:sz="1"/>
+              <w:left w:val="single" w:color="D0D4E0" w:sz="1"/>
+              <w:bottom w:val="single" w:color="D0D4E0" w:sz="1"/>
+              <w:right w:val="single" w:color="D0D4E0" w:sz="1"/>
+            </w:tcBorders>
+            <w:shd w:fill="2B1A4A" w:val="clear"/>
+            <w:tcMar>
+              <w:top w:type="dxa" w:w="100"/>
+              <w:left w:type="dxa" w:w="200"/>
+              <w:bottom w:type="dxa" w:w="100"/>
+              <w:right w:type="dxa" w:w="200"/>
+            </w:tcMar>
+          </w:tcPr>
+          <w:p>
+            <w:r>
+              <w:rPr>
+                <w:rFonts w:ascii="Arial" w:cs="Arial" w:eastAsia="Arial" w:hAnsi="Arial"/>
+                <w:b/>
+                <w:bCs/>
+                <w:color w:val="CCBBEE"/>
+                <w:sz w:val="20"/>
+                <w:szCs w:val="20"/>
+              </w:rPr>
+              <w:t xml:space="preserve">Model Accuracy: </w:t>
+            </w:r>
+            <w:r>
+              <w:rPr>
+                <w:rFonts w:ascii="Arial" w:cs="Arial" w:eastAsia="Arial" w:hAnsi="Arial"/>
+                <w:b/>
+                <w:bCs/>
+                <w:color w:val="FFFFFF"/>
+                <w:sz w:val="22"/>
+                <w:szCs w:val="22"/>
+              </w:rPr>
+              <w:t xml:space="preserve">87.4%</w:t>
+            </w:r>
+            <w:r>
+              <w:rPr>
+                <w:rFonts w:ascii="Arial" w:cs="Arial" w:eastAsia="Arial" w:hAnsi="Arial"/>
+                <w:color w:val="CCBBEE"/>
+                <w:sz w:val="20"/>
+                <w:szCs w:val="20"/>
+              </w:rPr>
+              <w:t xml:space="preserve">   |   Algorithm: </w:t>
+            </w:r>
+            <w:r>
+              <w:rPr>
+                <w:rFonts w:ascii="Arial" w:cs="Arial" w:eastAsia="Arial" w:hAnsi="Arial"/>
+                <w:b/>
+                <w:bCs/>
+                <w:color w:val="FFFFFF"/>
+                <w:sz w:val="20"/>
+                <w:szCs w:val="20"/>
+              </w:rPr>
+              <w:t xml:space="preserve">CART Decision Tree</w:t>
             </w:r>
           </w:p>
         </w:tc>

</xml_diff>